<commit_message>
chore: updated Word template with new document variables
</commit_message>
<xml_diff>
--- a/public/doc/ДОГОВОР УСЛУГ продажа.docx
+++ b/public/doc/ДОГОВОР УСЛУГ продажа.docx
@@ -105,8 +105,18 @@
           <w:sz w:val="17"/>
           <w:szCs w:val="17"/>
         </w:rPr>
-        <w:t xml:space="preserve">   «</w:t>
-      </w:r>
+        <w:t xml:space="preserve">   </w:t>
+      </w:r>
+      <w:r>
+        <w:rPr>
+          <w:rFonts w:ascii="Times New Roman" w:eastAsia="Times New Roman" w:hAnsi="Times New Roman" w:cs="Times New Roman"/>
+          <w:color w:val="000000"/>
+          <w:sz w:val="17"/>
+          <w:szCs w:val="17"/>
+        </w:rPr>
+        <w:t xml:space="preserve">{current_date}</w:t>
+      </w:r>
+      <w:proofErr w:type="spellStart"/>
       <w:proofErr w:type="gramEnd"/>
       <w:r>
         <w:rPr>
@@ -115,7 +125,7 @@
           <w:sz w:val="17"/>
           <w:szCs w:val="17"/>
         </w:rPr>
-        <w:t xml:space="preserve">   </w:t>
+        <w:t/>
       </w:r>
       <w:proofErr w:type="gramStart"/>
       <w:r>
@@ -125,8 +135,9 @@
           <w:sz w:val="17"/>
           <w:szCs w:val="17"/>
         </w:rPr>
-        <w:t xml:space="preserve">  </w:t>
-      </w:r>
+        <w:t/>
+      </w:r>
+      <w:proofErr w:type="spellEnd"/>
       <w:r>
         <w:rPr>
           <w:rFonts w:ascii="Times New Roman" w:eastAsia="Times New Roman" w:hAnsi="Times New Roman" w:cs="Times New Roman"/>
@@ -134,63 +145,18 @@
           <w:sz w:val="17"/>
           <w:szCs w:val="17"/>
         </w:rPr>
-        <w:t>»</w:t>
+        <w:t/>
+      </w:r>
+      <w:r>
+        <w:rPr>
+          <w:rFonts w:ascii="Times New Roman" w:eastAsia="Times New Roman" w:hAnsi="Times New Roman" w:cs="Times New Roman"/>
+          <w:color w:val="000000"/>
+          <w:sz w:val="17"/>
+          <w:szCs w:val="17"/>
+        </w:rPr>
+        <w:t>г.</w:t>
       </w:r>
       <w:proofErr w:type="gramEnd"/>
-      <w:r>
-        <w:rPr>
-          <w:rFonts w:ascii="Times New Roman" w:eastAsia="Times New Roman" w:hAnsi="Times New Roman" w:cs="Times New Roman"/>
-          <w:color w:val="000000"/>
-          <w:sz w:val="17"/>
-          <w:szCs w:val="17"/>
-        </w:rPr>
-        <w:t xml:space="preserve"> </w:t>
-      </w:r>
-      <w:r>
-        <w:rPr>
-          <w:rFonts w:ascii="Times New Roman" w:eastAsia="Times New Roman" w:hAnsi="Times New Roman" w:cs="Times New Roman"/>
-          <w:color w:val="000000"/>
-          <w:sz w:val="17"/>
-          <w:szCs w:val="17"/>
-        </w:rPr>
-        <w:t xml:space="preserve">                      </w:t>
-      </w:r>
-      <w:r>
-        <w:rPr>
-          <w:rFonts w:ascii="Times New Roman" w:eastAsia="Times New Roman" w:hAnsi="Times New Roman" w:cs="Times New Roman"/>
-          <w:color w:val="000000"/>
-          <w:sz w:val="17"/>
-          <w:szCs w:val="17"/>
-        </w:rPr>
-        <w:t xml:space="preserve"> </w:t>
-      </w:r>
-      <w:r>
-        <w:rPr>
-          <w:rFonts w:ascii="Times New Roman" w:eastAsia="Times New Roman" w:hAnsi="Times New Roman" w:cs="Times New Roman"/>
-          <w:color w:val="000000"/>
-          <w:sz w:val="17"/>
-          <w:szCs w:val="17"/>
-        </w:rPr>
-        <w:t>202</w:t>
-      </w:r>
-      <w:r>
-        <w:rPr>
-          <w:rFonts w:ascii="Times New Roman" w:eastAsia="Times New Roman" w:hAnsi="Times New Roman" w:cs="Times New Roman"/>
-          <w:color w:val="000000"/>
-          <w:sz w:val="17"/>
-          <w:szCs w:val="17"/>
-        </w:rPr>
-        <w:t>5</w:t>
-      </w:r>
-      <w:r>
-        <w:rPr>
-          <w:rFonts w:ascii="Times New Roman" w:eastAsia="Times New Roman" w:hAnsi="Times New Roman" w:cs="Times New Roman"/>
-          <w:color w:val="000000"/>
-          <w:sz w:val="17"/>
-          <w:szCs w:val="17"/>
-        </w:rPr>
-        <w:t xml:space="preserve"> г.</w:t>
-      </w:r>
     </w:p>
     <w:p>
       <w:pPr>
@@ -420,7 +386,7 @@
           <w:sz w:val="17"/>
           <w:szCs w:val="17"/>
         </w:rPr>
-        <w:t>Самозанятый Ельчугин Александр Евгеньевич,</w:t>
+        <w:t xml:space="preserve">Самозанятый </w:t>
       </w:r>
       <w:r>
         <w:rPr>
@@ -431,156 +397,352 @@
           <w:sz w:val="17"/>
           <w:szCs w:val="17"/>
         </w:rPr>
-        <w:t xml:space="preserve"> </w:t>
-      </w:r>
-      <w:r>
-        <w:rPr>
-          <w:rFonts w:ascii="Times New Roman" w:eastAsia="Times New Roman" w:hAnsi="Times New Roman" w:cs="Times New Roman"/>
-          <w:color w:val="000000"/>
-          <w:sz w:val="17"/>
-          <w:szCs w:val="17"/>
-        </w:rPr>
-        <w:t xml:space="preserve">ИНН </w:t>
-      </w:r>
-      <w:r>
-        <w:rPr>
-          <w:rFonts w:ascii="Times New Roman" w:eastAsia="Times New Roman" w:hAnsi="Times New Roman" w:cs="Times New Roman"/>
-          <w:color w:val="000000"/>
-          <w:sz w:val="17"/>
-          <w:szCs w:val="17"/>
-        </w:rPr>
-        <w:t>434549745987</w:t>
-      </w:r>
-      <w:r>
-        <w:rPr>
-          <w:rFonts w:ascii="Times New Roman" w:eastAsia="Times New Roman" w:hAnsi="Times New Roman" w:cs="Times New Roman"/>
-          <w:sz w:val="17"/>
-          <w:szCs w:val="17"/>
-        </w:rPr>
-        <w:t xml:space="preserve">, </w:t>
-      </w:r>
-      <w:r>
-        <w:rPr>
-          <w:rFonts w:ascii="Times New Roman" w:eastAsia="Times New Roman" w:hAnsi="Times New Roman" w:cs="Times New Roman"/>
-          <w:color w:val="000000"/>
-          <w:sz w:val="17"/>
-          <w:szCs w:val="17"/>
-        </w:rPr>
-        <w:t>паспорт серия</w:t>
-      </w:r>
-      <w:r>
-        <w:rPr>
-          <w:rFonts w:ascii="Times New Roman" w:eastAsia="Times New Roman" w:hAnsi="Times New Roman" w:cs="Times New Roman"/>
-          <w:color w:val="000000"/>
-          <w:sz w:val="17"/>
-          <w:szCs w:val="17"/>
-        </w:rPr>
-        <w:t>:</w:t>
-      </w:r>
-      <w:r>
-        <w:rPr>
-          <w:rFonts w:ascii="Times New Roman" w:eastAsia="Times New Roman" w:hAnsi="Times New Roman" w:cs="Times New Roman"/>
-          <w:color w:val="000000"/>
-          <w:sz w:val="17"/>
-          <w:szCs w:val="17"/>
-        </w:rPr>
-        <w:t xml:space="preserve"> </w:t>
-      </w:r>
-      <w:r>
-        <w:rPr>
-          <w:rFonts w:ascii="Times New Roman" w:eastAsia="Times New Roman" w:hAnsi="Times New Roman" w:cs="Times New Roman"/>
-          <w:color w:val="000000"/>
-          <w:sz w:val="17"/>
-          <w:szCs w:val="17"/>
-        </w:rPr>
-        <w:t>3302</w:t>
-      </w:r>
-      <w:r>
-        <w:rPr>
-          <w:rFonts w:ascii="Times New Roman" w:eastAsia="Times New Roman" w:hAnsi="Times New Roman" w:cs="Times New Roman"/>
-          <w:color w:val="000000"/>
-          <w:sz w:val="17"/>
-          <w:szCs w:val="17"/>
-        </w:rPr>
-        <w:t xml:space="preserve"> номер</w:t>
-      </w:r>
-      <w:r>
-        <w:rPr>
-          <w:rFonts w:ascii="Times New Roman" w:eastAsia="Times New Roman" w:hAnsi="Times New Roman" w:cs="Times New Roman"/>
-          <w:color w:val="000000"/>
-          <w:sz w:val="17"/>
-          <w:szCs w:val="17"/>
-        </w:rPr>
-        <w:t>:</w:t>
-      </w:r>
-      <w:r>
-        <w:rPr>
-          <w:rFonts w:ascii="Times New Roman" w:eastAsia="Times New Roman" w:hAnsi="Times New Roman" w:cs="Times New Roman"/>
-          <w:color w:val="000000"/>
-          <w:sz w:val="17"/>
-          <w:szCs w:val="17"/>
-        </w:rPr>
-        <w:t xml:space="preserve"> </w:t>
-      </w:r>
-      <w:r>
-        <w:rPr>
-          <w:rFonts w:ascii="Times New Roman" w:eastAsia="Times New Roman" w:hAnsi="Times New Roman" w:cs="Times New Roman"/>
-          <w:color w:val="000000"/>
-          <w:sz w:val="17"/>
-          <w:szCs w:val="17"/>
-        </w:rPr>
-        <w:t>927750,</w:t>
-      </w:r>
-      <w:r>
-        <w:rPr>
-          <w:rFonts w:ascii="Times New Roman" w:eastAsia="Times New Roman" w:hAnsi="Times New Roman" w:cs="Times New Roman"/>
-          <w:color w:val="000000"/>
-          <w:sz w:val="17"/>
-          <w:szCs w:val="17"/>
-        </w:rPr>
-        <w:t xml:space="preserve"> выдан </w:t>
-      </w:r>
-      <w:r>
-        <w:rPr>
-          <w:rFonts w:ascii="Times New Roman" w:eastAsia="Times New Roman" w:hAnsi="Times New Roman" w:cs="Times New Roman"/>
-          <w:color w:val="000000"/>
-          <w:sz w:val="17"/>
-          <w:szCs w:val="17"/>
-        </w:rPr>
-        <w:t xml:space="preserve">Ленинским РОВД г. Кирова, </w:t>
-      </w:r>
-      <w:r>
-        <w:rPr>
-          <w:rFonts w:ascii="Times New Roman" w:eastAsia="Times New Roman" w:hAnsi="Times New Roman" w:cs="Times New Roman"/>
-          <w:color w:val="000000"/>
-          <w:sz w:val="17"/>
-          <w:szCs w:val="17"/>
-        </w:rPr>
-        <w:t xml:space="preserve">дата выдачи: </w:t>
-      </w:r>
-      <w:r>
-        <w:rPr>
-          <w:rFonts w:ascii="Times New Roman" w:eastAsia="Times New Roman" w:hAnsi="Times New Roman" w:cs="Times New Roman"/>
-          <w:color w:val="000000"/>
-          <w:sz w:val="17"/>
-          <w:szCs w:val="17"/>
-        </w:rPr>
-        <w:t>21.01.2003 г.</w:t>
-      </w:r>
-      <w:r>
-        <w:rPr>
-          <w:rFonts w:ascii="Times New Roman" w:eastAsia="Times New Roman" w:hAnsi="Times New Roman" w:cs="Times New Roman"/>
-          <w:color w:val="000000" w:themeColor="text1"/>
-          <w:sz w:val="17"/>
-          <w:szCs w:val="17"/>
-        </w:rPr>
-        <w:t xml:space="preserve">, со второй стороны, именуемый в дальнейшем </w:t>
-      </w:r>
+        <w:t xml:space="preserve">{realtor_fullname}</w:t>
+      </w:r>
+      <w:proofErr w:type="spellStart"/>
       <w:r>
         <w:rPr>
           <w:rFonts w:ascii="Times New Roman" w:eastAsia="Times New Roman" w:hAnsi="Times New Roman" w:cs="Times New Roman"/>
           <w:b/>
           <w:bCs/>
+          <w:color w:val="000000"/>
+          <w:sz w:val="17"/>
+          <w:szCs w:val="17"/>
+        </w:rPr>
+        <w:t/>
+      </w:r>
+      <w:proofErr w:type="spellEnd"/>
+      <w:r>
+        <w:rPr>
+          <w:rFonts w:ascii="Times New Roman" w:eastAsia="Times New Roman" w:hAnsi="Times New Roman" w:cs="Times New Roman"/>
+          <w:b/>
+          <w:bCs/>
+          <w:color w:val="000000"/>
+          <w:sz w:val="17"/>
+          <w:szCs w:val="17"/>
+        </w:rPr>
+        <w:t/>
+      </w:r>
+      <w:r>
+        <w:rPr>
+          <w:rFonts w:ascii="Times New Roman" w:eastAsia="Times New Roman" w:hAnsi="Times New Roman" w:cs="Times New Roman"/>
+          <w:b/>
+          <w:bCs/>
+          <w:color w:val="000000"/>
+          <w:sz w:val="17"/>
+          <w:szCs w:val="17"/>
+        </w:rPr>
+        <w:t>,</w:t>
+      </w:r>
+      <w:r>
+        <w:rPr>
+          <w:rFonts w:ascii="Times New Roman" w:eastAsia="Times New Roman" w:hAnsi="Times New Roman" w:cs="Times New Roman"/>
+          <w:b/>
+          <w:bCs/>
+          <w:color w:val="000000"/>
+          <w:sz w:val="17"/>
+          <w:szCs w:val="17"/>
+        </w:rPr>
+        <w:t xml:space="preserve"> </w:t>
+      </w:r>
+      <w:r>
+        <w:rPr>
+          <w:rFonts w:ascii="Times New Roman" w:eastAsia="Times New Roman" w:hAnsi="Times New Roman" w:cs="Times New Roman"/>
+          <w:color w:val="000000"/>
+          <w:sz w:val="17"/>
+          <w:szCs w:val="17"/>
+        </w:rPr>
+        <w:t>ИНН</w:t>
+      </w:r>
+      <w:r>
+        <w:rPr>
+          <w:rFonts w:ascii="Times New Roman" w:eastAsia="Times New Roman" w:hAnsi="Times New Roman" w:cs="Times New Roman"/>
+          <w:color w:val="000000"/>
+          <w:sz w:val="17"/>
+          <w:szCs w:val="17"/>
+        </w:rPr>
+        <w:t xml:space="preserve"> {realtor_inn}</w:t>
+      </w:r>
+      <w:r>
+        <w:rPr>
+          <w:rFonts w:ascii="Times New Roman" w:eastAsia="Times New Roman" w:hAnsi="Times New Roman" w:cs="Times New Roman"/>
+          <w:color w:val="000000"/>
+          <w:sz w:val="17"/>
+          <w:szCs w:val="17"/>
+          <w:lang w:val="en-US"/>
+        </w:rPr>
+        <w:t/>
+      </w:r>
+      <w:r>
+        <w:rPr>
+          <w:rFonts w:ascii="Times New Roman" w:eastAsia="Times New Roman" w:hAnsi="Times New Roman" w:cs="Times New Roman"/>
+          <w:color w:val="000000"/>
+          <w:sz w:val="17"/>
+          <w:szCs w:val="17"/>
+        </w:rPr>
+        <w:t/>
+      </w:r>
+      <w:r>
+        <w:rPr>
+          <w:rFonts w:ascii="Times New Roman" w:eastAsia="Times New Roman" w:hAnsi="Times New Roman" w:cs="Times New Roman"/>
+          <w:color w:val="000000"/>
+          <w:sz w:val="17"/>
+          <w:szCs w:val="17"/>
+          <w:lang w:val="en-US"/>
+        </w:rPr>
+        <w:t/>
+      </w:r>
+      <w:r>
+        <w:rPr>
+          <w:rFonts w:ascii="Times New Roman" w:eastAsia="Times New Roman" w:hAnsi="Times New Roman" w:cs="Times New Roman"/>
+          <w:color w:val="000000"/>
+          <w:sz w:val="17"/>
+          <w:szCs w:val="17"/>
+        </w:rPr>
+        <w:t xml:space="preserve">,</w:t>
+      </w:r>
+      <w:r>
+        <w:rPr>
+          <w:rFonts w:ascii="Times New Roman" w:eastAsia="Times New Roman" w:hAnsi="Times New Roman" w:cs="Times New Roman"/>
+          <w:color w:val="000000"/>
+          <w:sz w:val="17"/>
+          <w:szCs w:val="17"/>
+        </w:rPr>
+        <w:t xml:space="preserve"> </w:t>
+      </w:r>
+      <w:r>
+        <w:rPr>
+          <w:rFonts w:ascii="Times New Roman" w:eastAsia="Times New Roman" w:hAnsi="Times New Roman" w:cs="Times New Roman"/>
+          <w:color w:val="000000"/>
+          <w:sz w:val="17"/>
+          <w:szCs w:val="17"/>
+        </w:rPr>
+        <w:t xml:space="preserve">паспорт серия </w:t>
+      </w:r>
+      <w:r>
+        <w:rPr>
+          <w:rFonts w:ascii="Times New Roman" w:eastAsia="Times New Roman" w:hAnsi="Times New Roman" w:cs="Times New Roman"/>
+          <w:color w:val="000000"/>
+          <w:sz w:val="17"/>
+          <w:szCs w:val="17"/>
+        </w:rPr>
+        <w:t xml:space="preserve">{realtor_passport_series}</w:t>
+      </w:r>
+      <w:proofErr w:type="spellStart"/>
+      <w:r>
+        <w:rPr>
+          <w:rFonts w:ascii="Times New Roman" w:eastAsia="Times New Roman" w:hAnsi="Times New Roman" w:cs="Times New Roman"/>
+          <w:color w:val="000000"/>
+          <w:sz w:val="17"/>
+          <w:szCs w:val="17"/>
+        </w:rPr>
+        <w:t/>
+      </w:r>
+      <w:proofErr w:type="spellEnd"/>
+      <w:r>
+        <w:rPr>
+          <w:rFonts w:ascii="Times New Roman" w:eastAsia="Times New Roman" w:hAnsi="Times New Roman" w:cs="Times New Roman"/>
+          <w:color w:val="000000"/>
+          <w:sz w:val="17"/>
+          <w:szCs w:val="17"/>
+        </w:rPr>
+        <w:t/>
+      </w:r>
+      <w:r>
+        <w:rPr>
+          <w:rFonts w:ascii="Times New Roman" w:eastAsia="Times New Roman" w:hAnsi="Times New Roman" w:cs="Times New Roman"/>
+          <w:color w:val="000000"/>
+          <w:sz w:val="17"/>
+          <w:szCs w:val="17"/>
+        </w:rPr>
+        <w:t xml:space="preserve"> номер </w:t>
+      </w:r>
+      <w:r>
+        <w:rPr>
+          <w:rFonts w:ascii="Times New Roman" w:eastAsia="Times New Roman" w:hAnsi="Times New Roman" w:cs="Times New Roman"/>
+          <w:color w:val="000000"/>
+          <w:sz w:val="17"/>
+          <w:szCs w:val="17"/>
+        </w:rPr>
+        <w:t xml:space="preserve">{realtor_passport_number}</w:t>
+      </w:r>
+      <w:proofErr w:type="spellStart"/>
+      <w:r>
+        <w:rPr>
+          <w:rFonts w:ascii="Times New Roman" w:eastAsia="Times New Roman" w:hAnsi="Times New Roman" w:cs="Times New Roman"/>
+          <w:color w:val="000000"/>
+          <w:sz w:val="17"/>
+          <w:szCs w:val="17"/>
+        </w:rPr>
+        <w:t/>
+      </w:r>
+      <w:proofErr w:type="spellEnd"/>
+      <w:r>
+        <w:rPr>
+          <w:rFonts w:ascii="Times New Roman" w:eastAsia="Times New Roman" w:hAnsi="Times New Roman" w:cs="Times New Roman"/>
+          <w:color w:val="000000"/>
+          <w:sz w:val="17"/>
+          <w:szCs w:val="17"/>
+        </w:rPr>
+        <w:t/>
+      </w:r>
+      <w:r>
+        <w:rPr>
+          <w:rFonts w:ascii="Times New Roman" w:eastAsia="Times New Roman" w:hAnsi="Times New Roman" w:cs="Times New Roman"/>
+          <w:color w:val="000000"/>
+          <w:sz w:val="17"/>
+          <w:szCs w:val="17"/>
+        </w:rPr>
+        <w:t xml:space="preserve">, </w:t>
+      </w:r>
+      <w:proofErr w:type="gramStart"/>
+      <w:r>
+        <w:rPr>
+          <w:rFonts w:ascii="Times New Roman" w:eastAsia="Times New Roman" w:hAnsi="Times New Roman" w:cs="Times New Roman"/>
+          <w:color w:val="000000"/>
+          <w:sz w:val="17"/>
+          <w:szCs w:val="17"/>
+        </w:rPr>
+        <w:t xml:space="preserve">выдан  </w:t>
+      </w:r>
+      <w:r>
+        <w:rPr>
+          <w:rFonts w:ascii="Times New Roman" w:eastAsia="Times New Roman" w:hAnsi="Times New Roman" w:cs="Times New Roman"/>
+          <w:color w:val="000000"/>
+          <w:sz w:val="17"/>
+          <w:szCs w:val="17"/>
+        </w:rPr>
+        <w:t xml:space="preserve">{realtor_passport_issued_by}</w:t>
+      </w:r>
+      <w:proofErr w:type="spellStart"/>
+      <w:proofErr w:type="gramEnd"/>
+      <w:r>
+        <w:rPr>
+          <w:rFonts w:ascii="Times New Roman" w:eastAsia="Times New Roman" w:hAnsi="Times New Roman" w:cs="Times New Roman"/>
+          <w:color w:val="000000"/>
+          <w:sz w:val="17"/>
+          <w:szCs w:val="17"/>
+        </w:rPr>
+        <w:t/>
+      </w:r>
+      <w:proofErr w:type="spellEnd"/>
+      <w:r>
+        <w:rPr>
+          <w:rFonts w:ascii="Times New Roman" w:eastAsia="Times New Roman" w:hAnsi="Times New Roman" w:cs="Times New Roman"/>
+          <w:color w:val="000000"/>
+          <w:sz w:val="17"/>
+          <w:szCs w:val="17"/>
+        </w:rPr>
+        <w:t/>
+      </w:r>
+      <w:r>
+        <w:rPr>
+          <w:rFonts w:ascii="Times New Roman" w:eastAsia="Times New Roman" w:hAnsi="Times New Roman" w:cs="Times New Roman"/>
+          <w:color w:val="000000"/>
+          <w:sz w:val="17"/>
+          <w:szCs w:val="17"/>
+        </w:rPr>
+        <w:t xml:space="preserve">, </w:t>
+      </w:r>
+      <w:r>
+        <w:rPr>
+          <w:rFonts w:ascii="Times New Roman" w:eastAsia="Times New Roman" w:hAnsi="Times New Roman" w:cs="Times New Roman"/>
+          <w:color w:val="000000"/>
+          <w:sz w:val="17"/>
+          <w:szCs w:val="17"/>
+        </w:rPr>
+        <w:t xml:space="preserve">дата выдачи: </w:t>
+      </w:r>
+      <w:r>
+        <w:rPr>
+          <w:rFonts w:ascii="Times New Roman" w:eastAsia="Times New Roman" w:hAnsi="Times New Roman" w:cs="Times New Roman"/>
+          <w:color w:val="000000"/>
+          <w:sz w:val="17"/>
+          <w:szCs w:val="17"/>
+        </w:rPr>
+        <w:t xml:space="preserve">{realtor_passport_issue_date}</w:t>
+      </w:r>
+      <w:proofErr w:type="spellStart"/>
+      <w:r>
+        <w:rPr>
+          <w:rFonts w:ascii="Times New Roman" w:eastAsia="Times New Roman" w:hAnsi="Times New Roman" w:cs="Times New Roman"/>
+          <w:color w:val="000000"/>
+          <w:sz w:val="17"/>
+          <w:szCs w:val="17"/>
+        </w:rPr>
+        <w:t/>
+      </w:r>
+      <w:proofErr w:type="spellEnd"/>
+      <w:r>
+        <w:rPr>
+          <w:rFonts w:ascii="Times New Roman" w:eastAsia="Times New Roman" w:hAnsi="Times New Roman" w:cs="Times New Roman"/>
+          <w:color w:val="000000"/>
+          <w:sz w:val="17"/>
+          <w:szCs w:val="17"/>
+        </w:rPr>
+        <w:t/>
+      </w:r>
+      <w:r>
+        <w:rPr>
+          <w:rFonts w:ascii="Times New Roman" w:eastAsia="Times New Roman" w:hAnsi="Times New Roman" w:cs="Times New Roman"/>
+          <w:color w:val="000000"/>
+          <w:sz w:val="17"/>
+          <w:szCs w:val="17"/>
+        </w:rPr>
+        <w:t>,</w:t>
+      </w:r>
+      <w:r>
+        <w:rPr>
+          <w:rFonts w:ascii="Times New Roman" w:eastAsia="Times New Roman" w:hAnsi="Times New Roman" w:cs="Times New Roman"/>
+          <w:color w:val="000000"/>
+          <w:sz w:val="17"/>
+          <w:szCs w:val="17"/>
+        </w:rPr>
+        <w:t xml:space="preserve"> регистрация: </w:t>
+      </w:r>
+      <w:r>
+        <w:rPr>
+          <w:rFonts w:ascii="Times New Roman" w:eastAsia="Times New Roman" w:hAnsi="Times New Roman" w:cs="Times New Roman"/>
+          <w:color w:val="000000"/>
+          <w:sz w:val="17"/>
+          <w:szCs w:val="17"/>
+        </w:rPr>
+        <w:t xml:space="preserve">{realtor_passport_address}</w:t>
+      </w:r>
+      <w:proofErr w:type="spellStart"/>
+      <w:r>
+        <w:rPr>
+          <w:rFonts w:ascii="Times New Roman" w:eastAsia="Times New Roman" w:hAnsi="Times New Roman" w:cs="Times New Roman"/>
+          <w:color w:val="000000"/>
+          <w:sz w:val="17"/>
+          <w:szCs w:val="17"/>
+        </w:rPr>
+        <w:t/>
+      </w:r>
+      <w:proofErr w:type="spellEnd"/>
+      <w:r>
+        <w:rPr>
+          <w:rFonts w:ascii="Times New Roman" w:eastAsia="Times New Roman" w:hAnsi="Times New Roman" w:cs="Times New Roman"/>
+          <w:color w:val="000000"/>
+          <w:sz w:val="17"/>
+          <w:szCs w:val="17"/>
+        </w:rPr>
+        <w:t/>
+      </w:r>
+      <w:r>
+        <w:rPr>
+          <w:rFonts w:ascii="Times New Roman" w:eastAsia="Times New Roman" w:hAnsi="Times New Roman" w:cs="Times New Roman"/>
+          <w:color w:val="000000" w:themeColor="text1"/>
+          <w:sz w:val="17"/>
+          <w:szCs w:val="17"/>
+        </w:rPr>
+        <w:t xml:space="preserve">, со второй стороны, именуемый в дальнейшем </w:t>
+      </w:r>
+      <w:r>
+        <w:rPr>
+          <w:rFonts w:ascii="Times New Roman" w:eastAsia="Times New Roman" w:hAnsi="Times New Roman" w:cs="Times New Roman"/>
+          <w:b/>
+          <w:bCs/>
           <w:color w:val="000000" w:themeColor="text1"/>
           <w:sz w:val="17"/>
           <w:szCs w:val="17"/>
@@ -624,7 +786,7 @@
           <w:sz w:val="17"/>
           <w:szCs w:val="17"/>
         </w:rPr>
-        <w:t>______________________________________________________</w:t>
+        <w:t xml:space="preserve">{client_fullname}, дата рождения: {client_birth_date}, СНИЛС: {client_snils}, паспорт серия {passport_series} номер {passport_number}, выдан {passport_issued_by}, код подразделения {passport_unit_code}, дата выдачи: {passport_issue_date}, зарегистрирован(а) по адресу: {passport_address}</w:t>
       </w:r>
       <w:r>
         <w:rPr>
@@ -632,8 +794,9 @@
           <w:color w:val="000000"/>
           <w:sz w:val="17"/>
           <w:szCs w:val="17"/>
-        </w:rPr>
-        <w:t>_____</w:t>
+          <w:lang w:val="en-US"/>
+        </w:rPr>
+        <w:t/>
       </w:r>
       <w:r>
         <w:rPr>
@@ -642,35 +805,37 @@
           <w:sz w:val="17"/>
           <w:szCs w:val="17"/>
         </w:rPr>
-        <w:t>____________________________________________________</w:t>
-      </w:r>
-      <w:r>
-        <w:rPr>
-          <w:rFonts w:ascii="Times New Roman" w:eastAsia="Times New Roman" w:hAnsi="Times New Roman" w:cs="Times New Roman"/>
-          <w:sz w:val="17"/>
-          <w:szCs w:val="17"/>
-        </w:rPr>
-        <w:t> </w:t>
-      </w:r>
-    </w:p>
-    <w:p>
-      <w:pPr>
-        <w:widowControl/>
-        <w:ind w:firstLine="0"/>
-        <w:rPr>
-          <w:rFonts w:ascii="Times New Roman" w:eastAsia="Times New Roman" w:hAnsi="Times New Roman" w:cs="Times New Roman"/>
-          <w:sz w:val="17"/>
-          <w:szCs w:val="17"/>
-        </w:rPr>
-      </w:pPr>
+        <w:t/>
+      </w:r>
+      <w:proofErr w:type="spellStart"/>
       <w:r>
         <w:rPr>
           <w:rFonts w:ascii="Times New Roman" w:eastAsia="Times New Roman" w:hAnsi="Times New Roman" w:cs="Times New Roman"/>
           <w:color w:val="000000"/>
           <w:sz w:val="17"/>
           <w:szCs w:val="17"/>
-        </w:rPr>
-        <w:t>дата рождения: ________________________________________, паспорт серия _________________ номер __________________________ выдан  _____________________________________________________________________________________________________________________________________________________________________________________________________________дата выдачи: ________________</w:t>
+          <w:lang w:val="en-US"/>
+        </w:rPr>
+        <w:t/>
+      </w:r>
+      <w:proofErr w:type="spellEnd"/>
+      <w:r>
+        <w:rPr>
+          <w:rFonts w:ascii="Times New Roman" w:eastAsia="Times New Roman" w:hAnsi="Times New Roman" w:cs="Times New Roman"/>
+          <w:color w:val="000000"/>
+          <w:sz w:val="17"/>
+          <w:szCs w:val="17"/>
+        </w:rPr>
+        <w:t/>
+      </w:r>
+      <w:r>
+        <w:rPr>
+          <w:rFonts w:ascii="Times New Roman" w:eastAsia="Times New Roman" w:hAnsi="Times New Roman" w:cs="Times New Roman"/>
+          <w:color w:val="000000"/>
+          <w:sz w:val="17"/>
+          <w:szCs w:val="17"/>
+        </w:rPr>
+        <w:t xml:space="preserve">, </w:t>
       </w:r>
     </w:p>
     <w:p>
@@ -1165,8 +1330,147 @@
                 <w:rFonts w:ascii="Times New Roman" w:eastAsia="Times New Roman" w:hAnsi="Times New Roman" w:cs="Times New Roman"/>
                 <w:b/>
                 <w:bCs/>
+                <w:lang w:val="en-US"/>
               </w:rPr>
             </w:pPr>
+            <w:r>
+              <w:rPr>
+                <w:rFonts w:ascii="Times New Roman" w:eastAsia="Times New Roman" w:hAnsi="Times New Roman" w:cs="Times New Roman"/>
+                <w:b/>
+                <w:bCs/>
+                <w:lang w:val="en-US"/>
+              </w:rPr>
+              <w:t xml:space="preserve">{property_city}</w:t>
+            </w:r>
+            <w:proofErr w:type="spellStart"/>
+            <w:r>
+              <w:rPr>
+                <w:rFonts w:ascii="Times New Roman" w:eastAsia="Times New Roman" w:hAnsi="Times New Roman" w:cs="Times New Roman"/>
+                <w:b/>
+                <w:bCs/>
+                <w:lang w:val="en-US"/>
+              </w:rPr>
+              <w:t/>
+            </w:r>
+            <w:proofErr w:type="spellEnd"/>
+            <w:r>
+              <w:rPr>
+                <w:rFonts w:ascii="Times New Roman" w:eastAsia="Times New Roman" w:hAnsi="Times New Roman" w:cs="Times New Roman"/>
+                <w:b/>
+                <w:bCs/>
+                <w:lang w:val="en-US"/>
+              </w:rPr>
+              <w:t/>
+            </w:r>
+            <w:r>
+              <w:rPr>
+                <w:rFonts w:ascii="Times New Roman" w:eastAsia="Times New Roman" w:hAnsi="Times New Roman" w:cs="Times New Roman"/>
+                <w:b/>
+                <w:bCs/>
+                <w:lang w:val="en-US"/>
+              </w:rPr>
+              <w:t xml:space="preserve">, </w:t>
+            </w:r>
+            <w:r>
+              <w:rPr>
+                <w:rFonts w:ascii="Times New Roman" w:eastAsia="Times New Roman" w:hAnsi="Times New Roman" w:cs="Times New Roman"/>
+                <w:b/>
+                <w:bCs/>
+                <w:lang w:val="en-US"/>
+              </w:rPr>
+              <w:t xml:space="preserve">{property_address}</w:t>
+            </w:r>
+            <w:proofErr w:type="spellStart"/>
+            <w:r>
+              <w:rPr>
+                <w:rFonts w:ascii="Times New Roman" w:eastAsia="Times New Roman" w:hAnsi="Times New Roman" w:cs="Times New Roman"/>
+                <w:b/>
+                <w:bCs/>
+                <w:lang w:val="en-US"/>
+              </w:rPr>
+              <w:t/>
+            </w:r>
+            <w:proofErr w:type="spellEnd"/>
+            <w:r>
+              <w:rPr>
+                <w:rFonts w:ascii="Times New Roman" w:eastAsia="Times New Roman" w:hAnsi="Times New Roman" w:cs="Times New Roman"/>
+                <w:b/>
+                <w:bCs/>
+                <w:lang w:val="en-US"/>
+              </w:rPr>
+              <w:t/>
+            </w:r>
+            <w:r>
+              <w:rPr>
+                <w:rFonts w:ascii="Times New Roman" w:eastAsia="Times New Roman" w:hAnsi="Times New Roman" w:cs="Times New Roman"/>
+                <w:b/>
+                <w:bCs/>
+                <w:lang w:val="en-US"/>
+              </w:rPr>
+              <w:t xml:space="preserve">, </w:t>
+            </w:r>
+            <w:proofErr w:type="spellStart"/>
+            <w:r>
+              <w:rPr>
+                <w:rFonts w:ascii="Times New Roman" w:eastAsia="Times New Roman" w:hAnsi="Times New Roman" w:cs="Times New Roman"/>
+                <w:b/>
+                <w:bCs/>
+              </w:rPr>
+              <w:t>кад</w:t>
+            </w:r>
+            <w:proofErr w:type="spellEnd"/>
+            <w:r>
+              <w:rPr>
+                <w:rFonts w:ascii="Times New Roman" w:eastAsia="Times New Roman" w:hAnsi="Times New Roman" w:cs="Times New Roman"/>
+                <w:b/>
+                <w:bCs/>
+                <w:lang w:val="en-US"/>
+              </w:rPr>
+              <w:t xml:space="preserve">. </w:t>
+            </w:r>
+            <w:r>
+              <w:rPr>
+                <w:rFonts w:ascii="Times New Roman" w:eastAsia="Times New Roman" w:hAnsi="Times New Roman" w:cs="Times New Roman"/>
+                <w:b/>
+                <w:bCs/>
+              </w:rPr>
+              <w:t>№</w:t>
+            </w:r>
+            <w:r>
+              <w:rPr>
+                <w:rFonts w:ascii="Times New Roman" w:eastAsia="Times New Roman" w:hAnsi="Times New Roman" w:cs="Times New Roman"/>
+                <w:b/>
+                <w:bCs/>
+                <w:lang w:val="en-US"/>
+              </w:rPr>
+              <w:t xml:space="preserve"> </w:t>
+            </w:r>
+            <w:r>
+              <w:rPr>
+                <w:rFonts w:ascii="Times New Roman" w:eastAsia="Times New Roman" w:hAnsi="Times New Roman" w:cs="Times New Roman"/>
+                <w:b/>
+                <w:bCs/>
+              </w:rPr>
+              <w:t xml:space="preserve">{property_cadastral}</w:t>
+            </w:r>
+            <w:proofErr w:type="spellStart"/>
+            <w:r>
+              <w:rPr>
+                <w:rFonts w:ascii="Times New Roman" w:eastAsia="Times New Roman" w:hAnsi="Times New Roman" w:cs="Times New Roman"/>
+                <w:b/>
+                <w:bCs/>
+              </w:rPr>
+              <w:t/>
+            </w:r>
+            <w:proofErr w:type="spellEnd"/>
+            <w:r>
+              <w:rPr>
+                <w:rFonts w:ascii="Times New Roman" w:eastAsia="Times New Roman" w:hAnsi="Times New Roman" w:cs="Times New Roman"/>
+                <w:b/>
+                <w:bCs/>
+              </w:rPr>
+              <w:t/>
+            </w:r>
           </w:p>
         </w:tc>
       </w:tr>
@@ -1177,12 +1481,14 @@
         <w:ind w:firstLine="0"/>
         <w:rPr>
           <w:rFonts w:ascii="Times New Roman" w:eastAsia="Times New Roman" w:hAnsi="Times New Roman" w:cs="Times New Roman"/>
+          <w:lang w:val="en-US"/>
         </w:rPr>
       </w:pPr>
       <w:r>
         <w:rPr>
           <w:rFonts w:ascii="Times New Roman" w:eastAsia="Times New Roman" w:hAnsi="Times New Roman" w:cs="Times New Roman"/>
           <w:color w:val="000000"/>
+          <w:lang w:val="en-US"/>
         </w:rPr>
         <w:t> </w:t>
       </w:r>
@@ -1307,7 +1613,6 @@
         </w:rPr>
         <w:t>Получение с покупателя (</w:t>
       </w:r>
-      <w:proofErr w:type="spellStart"/>
       <w:r>
         <w:rPr>
           <w:rFonts w:ascii="Times New Roman" w:hAnsi="Times New Roman" w:cs="Times New Roman"/>
@@ -1315,17 +1620,7 @@
           <w:sz w:val="17"/>
           <w:szCs w:val="17"/>
         </w:rPr>
-        <w:t>правоприобретателя</w:t>
-      </w:r>
-      <w:proofErr w:type="spellEnd"/>
-      <w:r>
-        <w:rPr>
-          <w:rFonts w:ascii="Times New Roman" w:hAnsi="Times New Roman" w:cs="Times New Roman"/>
-          <w:color w:val="000000"/>
-          <w:sz w:val="17"/>
-          <w:szCs w:val="17"/>
-        </w:rPr>
-        <w:t xml:space="preserve">) </w:t>
+        <w:t xml:space="preserve">правоприобретателя) </w:t>
       </w:r>
       <w:r>
         <w:rPr>
@@ -1547,89 +1842,85 @@
           <w:sz w:val="17"/>
           <w:szCs w:val="17"/>
         </w:rPr>
-        <w:t>до  «</w:t>
-      </w:r>
+        <w:t xml:space="preserve">до  </w:t>
+      </w:r>
+      <w:r>
+        <w:rPr>
+          <w:rFonts w:ascii="Times New Roman" w:eastAsia="Times New Roman" w:hAnsi="Times New Roman" w:cs="Times New Roman"/>
+          <w:b/>
+          <w:bCs/>
+          <w:color w:val="000000" w:themeColor="text1"/>
+          <w:sz w:val="17"/>
+          <w:szCs w:val="17"/>
+        </w:rPr>
+        <w:t xml:space="preserve">{property_contract_endDate}</w:t>
+      </w:r>
+      <w:proofErr w:type="spellStart"/>
       <w:proofErr w:type="gramEnd"/>
       <w:r>
         <w:rPr>
           <w:rFonts w:ascii="Times New Roman" w:eastAsia="Times New Roman" w:hAnsi="Times New Roman" w:cs="Times New Roman"/>
-          <w:color w:val="000000" w:themeColor="text1"/>
-          <w:sz w:val="17"/>
-          <w:szCs w:val="17"/>
-        </w:rPr>
-        <w:t>___</w:t>
-      </w:r>
-      <w:r>
-        <w:rPr>
-          <w:rFonts w:ascii="Times New Roman" w:eastAsia="Times New Roman" w:hAnsi="Times New Roman" w:cs="Times New Roman"/>
-          <w:color w:val="000000" w:themeColor="text1"/>
-          <w:sz w:val="17"/>
-          <w:szCs w:val="17"/>
-        </w:rPr>
-        <w:t>__</w:t>
-      </w:r>
-      <w:r>
-        <w:rPr>
-          <w:rFonts w:ascii="Times New Roman" w:eastAsia="Times New Roman" w:hAnsi="Times New Roman" w:cs="Times New Roman"/>
-          <w:color w:val="000000" w:themeColor="text1"/>
-          <w:sz w:val="17"/>
-          <w:szCs w:val="17"/>
-        </w:rPr>
-        <w:t>__» ____</w:t>
-      </w:r>
-      <w:r>
-        <w:rPr>
-          <w:rFonts w:ascii="Times New Roman" w:eastAsia="Times New Roman" w:hAnsi="Times New Roman" w:cs="Times New Roman"/>
-          <w:color w:val="000000" w:themeColor="text1"/>
-          <w:sz w:val="17"/>
-          <w:szCs w:val="17"/>
-        </w:rPr>
-        <w:t>___</w:t>
-      </w:r>
-      <w:r>
-        <w:rPr>
-          <w:rFonts w:ascii="Times New Roman" w:eastAsia="Times New Roman" w:hAnsi="Times New Roman" w:cs="Times New Roman"/>
-          <w:color w:val="000000" w:themeColor="text1"/>
-          <w:sz w:val="17"/>
-          <w:szCs w:val="17"/>
-        </w:rPr>
-        <w:t>_____</w:t>
-      </w:r>
-      <w:r>
-        <w:rPr>
-          <w:rFonts w:ascii="Times New Roman" w:eastAsia="Times New Roman" w:hAnsi="Times New Roman" w:cs="Times New Roman"/>
-          <w:color w:val="000000" w:themeColor="text1"/>
-          <w:sz w:val="17"/>
-          <w:szCs w:val="17"/>
-        </w:rPr>
-        <w:t>__</w:t>
-      </w:r>
-      <w:r>
-        <w:rPr>
-          <w:rFonts w:ascii="Times New Roman" w:eastAsia="Times New Roman" w:hAnsi="Times New Roman" w:cs="Times New Roman"/>
-          <w:color w:val="000000" w:themeColor="text1"/>
-          <w:sz w:val="17"/>
-          <w:szCs w:val="17"/>
-        </w:rPr>
-        <w:t>____ 20_</w:t>
-      </w:r>
-      <w:r>
-        <w:rPr>
-          <w:rFonts w:ascii="Times New Roman" w:eastAsia="Times New Roman" w:hAnsi="Times New Roman" w:cs="Times New Roman"/>
-          <w:color w:val="000000" w:themeColor="text1"/>
-          <w:sz w:val="17"/>
-          <w:szCs w:val="17"/>
-        </w:rPr>
-        <w:t>___</w:t>
-      </w:r>
-      <w:r>
-        <w:rPr>
-          <w:rFonts w:ascii="Times New Roman" w:eastAsia="Times New Roman" w:hAnsi="Times New Roman" w:cs="Times New Roman"/>
-          <w:color w:val="000000" w:themeColor="text1"/>
-          <w:sz w:val="17"/>
-          <w:szCs w:val="17"/>
-        </w:rPr>
-        <w:t xml:space="preserve">__ г. </w:t>
+          <w:b/>
+          <w:bCs/>
+          <w:color w:val="000000" w:themeColor="text1"/>
+          <w:sz w:val="17"/>
+          <w:szCs w:val="17"/>
+        </w:rPr>
+        <w:t/>
+      </w:r>
+      <w:proofErr w:type="gramStart"/>
+      <w:r>
+        <w:rPr>
+          <w:rFonts w:ascii="Times New Roman" w:eastAsia="Times New Roman" w:hAnsi="Times New Roman" w:cs="Times New Roman"/>
+          <w:b/>
+          <w:bCs/>
+          <w:color w:val="000000" w:themeColor="text1"/>
+          <w:sz w:val="17"/>
+          <w:szCs w:val="17"/>
+        </w:rPr>
+        <w:t/>
+      </w:r>
+      <w:proofErr w:type="spellEnd"/>
+      <w:r>
+        <w:rPr>
+          <w:rFonts w:ascii="Times New Roman" w:eastAsia="Times New Roman" w:hAnsi="Times New Roman" w:cs="Times New Roman"/>
+          <w:b/>
+          <w:bCs/>
+          <w:color w:val="000000" w:themeColor="text1"/>
+          <w:sz w:val="17"/>
+          <w:szCs w:val="17"/>
+        </w:rPr>
+        <w:t/>
+      </w:r>
+      <w:r>
+        <w:rPr>
+          <w:rFonts w:ascii="Times New Roman" w:eastAsia="Times New Roman" w:hAnsi="Times New Roman" w:cs="Times New Roman"/>
+          <w:b/>
+          <w:bCs/>
+          <w:color w:val="000000" w:themeColor="text1"/>
+          <w:sz w:val="17"/>
+          <w:szCs w:val="17"/>
+        </w:rPr>
+        <w:t>г</w:t>
+      </w:r>
+      <w:r>
+        <w:rPr>
+          <w:rFonts w:ascii="Times New Roman" w:eastAsia="Times New Roman" w:hAnsi="Times New Roman" w:cs="Times New Roman"/>
+          <w:color w:val="000000" w:themeColor="text1"/>
+          <w:sz w:val="17"/>
+          <w:szCs w:val="17"/>
+        </w:rPr>
+        <w:t>.</w:t>
+      </w:r>
+      <w:proofErr w:type="gramEnd"/>
+      <w:r>
+        <w:rPr>
+          <w:rFonts w:ascii="Times New Roman" w:eastAsia="Times New Roman" w:hAnsi="Times New Roman" w:cs="Times New Roman"/>
+          <w:color w:val="000000" w:themeColor="text1"/>
+          <w:sz w:val="17"/>
+          <w:szCs w:val="17"/>
+        </w:rPr>
+        <w:t xml:space="preserve"> </w:t>
       </w:r>
       <w:r>
         <w:rPr>
@@ -3301,7 +3592,6 @@
               <w:bottom w:val="single" w:sz="8" w:space="0" w:color="FFFFFF"/>
               <w:right w:val="single" w:sz="8" w:space="0" w:color="FFFFFF"/>
             </w:tcBorders>
-            <w:shd w:val="clear" w:color="auto" w:fill="auto"/>
             <w:tcMar>
               <w:top w:w="100" w:type="dxa"/>
               <w:left w:w="100" w:type="dxa"/>
@@ -3484,7 +3774,6 @@
               <w:bottom w:val="single" w:sz="8" w:space="0" w:color="FFFFFF"/>
               <w:right w:val="single" w:sz="8" w:space="0" w:color="FFFFFF"/>
             </w:tcBorders>
-            <w:shd w:val="clear" w:color="auto" w:fill="auto"/>
             <w:tcMar>
               <w:top w:w="100" w:type="dxa"/>
               <w:left w:w="100" w:type="dxa"/>
@@ -3519,7 +3808,6 @@
               <w:bottom w:val="single" w:sz="8" w:space="0" w:color="FFFFFF"/>
               <w:right w:val="single" w:sz="8" w:space="0" w:color="FFFFFF"/>
             </w:tcBorders>
-            <w:shd w:val="clear" w:color="auto" w:fill="auto"/>
             <w:tcMar>
               <w:top w:w="100" w:type="dxa"/>
               <w:left w:w="100" w:type="dxa"/>
@@ -3554,7 +3842,6 @@
               <w:bottom w:val="single" w:sz="8" w:space="0" w:color="FFFFFF"/>
               <w:right w:val="single" w:sz="8" w:space="0" w:color="FFFFFF"/>
             </w:tcBorders>
-            <w:shd w:val="clear" w:color="auto" w:fill="auto"/>
             <w:tcMar>
               <w:top w:w="100" w:type="dxa"/>
               <w:left w:w="100" w:type="dxa"/>
@@ -3589,7 +3876,6 @@
               <w:bottom w:val="single" w:sz="8" w:space="0" w:color="FFFFFF"/>
               <w:right w:val="single" w:sz="8" w:space="0" w:color="FFFFFF"/>
             </w:tcBorders>
-            <w:shd w:val="clear" w:color="auto" w:fill="auto"/>
             <w:tcMar>
               <w:top w:w="100" w:type="dxa"/>
               <w:left w:w="100" w:type="dxa"/>
@@ -3624,7 +3910,6 @@
               <w:bottom w:val="single" w:sz="8" w:space="0" w:color="FFFFFF"/>
               <w:right w:val="single" w:sz="8" w:space="0" w:color="FFFFFF"/>
             </w:tcBorders>
-            <w:shd w:val="clear" w:color="auto" w:fill="auto"/>
             <w:tcMar>
               <w:top w:w="100" w:type="dxa"/>
               <w:left w:w="100" w:type="dxa"/>
@@ -3659,7 +3944,6 @@
               <w:bottom w:val="single" w:sz="8" w:space="0" w:color="FFFFFF"/>
               <w:right w:val="single" w:sz="8" w:space="0" w:color="FFFFFF"/>
             </w:tcBorders>
-            <w:shd w:val="clear" w:color="auto" w:fill="auto"/>
             <w:tcMar>
               <w:top w:w="100" w:type="dxa"/>
               <w:left w:w="100" w:type="dxa"/>
@@ -6920,7 +7204,6 @@
   <w:style w:type="character" w:default="1" w:styleId="a0">
     <w:name w:val="Default Paragraph Font"/>
     <w:uiPriority w:val="1"/>
-    <w:semiHidden/>
     <w:unhideWhenUsed/>
   </w:style>
   <w:style w:type="table" w:default="1" w:styleId="a1">

</xml_diff>